<commit_message>
added minutes template and implemented multiple documents download at a time.
</commit_message>
<xml_diff>
--- a/public/res/Hours_Template.docx
+++ b/public/res/Hours_Template.docx
@@ -66,17 +66,18 @@
         <w:pBdr>
           <w:bottom w:val="single" w:sz="4" w:space="1" w:color="auto"/>
         </w:pBdr>
-        <w:rPr>
-          <w:b/>
-          <w:sz w:val="24"/>
-          <w:szCs w:val="24"/>
+        <w:jc w:val="center"/>
+        <w:rPr>
+          <w:b/>
+          <w:sz w:val="23"/>
+          <w:szCs w:val="23"/>
         </w:rPr>
       </w:pPr>
       <w:r>
         <w:rPr>
           <w:b/>
-          <w:sz w:val="24"/>
-          <w:szCs w:val="24"/>
+          <w:sz w:val="23"/>
+          <w:szCs w:val="23"/>
         </w:rPr>
         <w:t>{address}</w:t>
       </w:r>

</xml_diff>

<commit_message>
perf: make bill total calculation instant via config cache
Eliminate per-keystroke network round-trips when calculating the bill total.
Previously calculateTotal fetched branch config from DynamoDB (session + HTTP + DB)
on every character typed, causing a 2-3s lag before the Total updated.

- Add ConfigContext: caches branch configs (incl. consumption/cpm) once on app
  load; lives in the layout so it survives tab switches. Demo users served from
  local config with no network calls.
- Extend /api/config/branches to return consumption, cpm, genCapacity
- Refactor calculateTotal into a pure synchronous function (no network)
- TableRow computes total synchronously from cached config; removes async
  .then chain and the cancelled-flag race guard
- Table reads branches from the cache instead of fetching on mount
- Update calculateTotal tests to the new synchronous signature

Foundation note: ConfigContext will also back upcoming fixes for history loading,
bulk download, and toast latency.
</commit_message>
<xml_diff>
--- a/public/res/Hours_Template.docx
+++ b/public/res/Hours_Template.docx
@@ -1,6 +1,6 @@
 
 <file path=word/document.xml><?xml version="1.0" encoding="utf-8"?>
-<w:document xmlns:wpc="http://schemas.microsoft.com/office/word/2010/wordprocessingCanvas" xmlns:cx="http://schemas.microsoft.com/office/drawing/2014/chartex" xmlns:cx1="http://schemas.microsoft.com/office/drawing/2015/9/8/chartex" xmlns:cx2="http://schemas.microsoft.com/office/drawing/2015/10/21/chartex" xmlns:cx3="http://schemas.microsoft.com/office/drawing/2016/5/9/chartex" xmlns:cx4="http://schemas.microsoft.com/office/drawing/2016/5/10/chartex" xmlns:cx5="http://schemas.microsoft.com/office/drawing/2016/5/11/chartex" xmlns:cx6="http://schemas.microsoft.com/office/drawing/2016/5/12/chartex" xmlns:cx7="http://schemas.microsoft.com/office/drawing/2016/5/13/chartex" xmlns:cx8="http://schemas.microsoft.com/office/drawing/2016/5/14/chartex" xmlns:mc="http://schemas.openxmlformats.org/markup-compatibility/2006" xmlns:aink="http://schemas.microsoft.com/office/drawing/2016/ink" xmlns:am3d="http://schemas.microsoft.com/office/drawing/2017/model3d" xmlns:o="urn:schemas-microsoft-com:office:office" xmlns:oel="http://schemas.microsoft.com/office/2019/extlst" xmlns:r="http://schemas.openxmlformats.org/officeDocument/2006/relationships" xmlns:m="http://schemas.openxmlformats.org/officeDocument/2006/math" xmlns:v="urn:schemas-microsoft-com:vml" xmlns:wp14="http://schemas.microsoft.com/office/word/2010/wordprocessingDrawing" xmlns:wp="http://schemas.openxmlformats.org/drawingml/2006/wordprocessingDrawing" xmlns:w10="urn:schemas-microsoft-com:office:word" xmlns:w="http://schemas.openxmlformats.org/wordprocessingml/2006/main" xmlns:w14="http://schemas.microsoft.com/office/word/2010/wordml" xmlns:w15="http://schemas.microsoft.com/office/word/2012/wordml" xmlns:w16cex="http://schemas.microsoft.com/office/word/2018/wordml/cex" xmlns:w16cid="http://schemas.microsoft.com/office/word/2016/wordml/cid" xmlns:w16="http://schemas.microsoft.com/office/word/2018/wordml" xmlns:w16du="http://schemas.microsoft.com/office/word/2023/wordml/word16du" xmlns:w16sdtdh="http://schemas.microsoft.com/office/word/2020/wordml/sdtdatahash" xmlns:w16se="http://schemas.microsoft.com/office/word/2015/wordml/symex" xmlns:wpg="http://schemas.microsoft.com/office/word/2010/wordprocessingGroup" xmlns:wpi="http://schemas.microsoft.com/office/word/2010/wordprocessingInk" xmlns:wne="http://schemas.microsoft.com/office/word/2006/wordml" xmlns:wps="http://schemas.microsoft.com/office/word/2010/wordprocessingShape" mc:Ignorable="w14 w15 w16se w16cid w16 w16cex w16sdtdh w16du wp14">
+<w:document xmlns:wpc="http://schemas.microsoft.com/office/word/2010/wordprocessingCanvas" xmlns:cx="http://schemas.microsoft.com/office/drawing/2014/chartex" xmlns:cx1="http://schemas.microsoft.com/office/drawing/2015/9/8/chartex" xmlns:cx2="http://schemas.microsoft.com/office/drawing/2015/10/21/chartex" xmlns:cx3="http://schemas.microsoft.com/office/drawing/2016/5/9/chartex" xmlns:cx4="http://schemas.microsoft.com/office/drawing/2016/5/10/chartex" xmlns:cx5="http://schemas.microsoft.com/office/drawing/2016/5/11/chartex" xmlns:cx6="http://schemas.microsoft.com/office/drawing/2016/5/12/chartex" xmlns:cx7="http://schemas.microsoft.com/office/drawing/2016/5/13/chartex" xmlns:cx8="http://schemas.microsoft.com/office/drawing/2016/5/14/chartex" xmlns:mc="http://schemas.openxmlformats.org/markup-compatibility/2006" xmlns:m="http://schemas.openxmlformats.org/officeDocument/2006/math" xmlns:aink="http://schemas.microsoft.com/office/drawing/2016/ink" xmlns:am3d="http://schemas.microsoft.com/office/drawing/2017/model3d" xmlns:oel="http://schemas.microsoft.com/office/2019/extlst" xmlns:r="http://schemas.openxmlformats.org/officeDocument/2006/relationships" xmlns:wp14="http://schemas.microsoft.com/office/word/2010/wordprocessingDrawing" xmlns:wp="http://schemas.openxmlformats.org/drawingml/2006/wordprocessingDrawing" xmlns:wpg="http://schemas.microsoft.com/office/word/2010/wordprocessingGroup" xmlns:wpi="http://schemas.microsoft.com/office/word/2010/wordprocessingInk" xmlns:wps="http://schemas.microsoft.com/office/word/2010/wordprocessingShape" xmlns:o="urn:schemas-microsoft-com:office:office" xmlns:v="urn:schemas-microsoft-com:vml" xmlns:w10="urn:schemas-microsoft-com:office:word" xmlns:w="http://schemas.openxmlformats.org/wordprocessingml/2006/main" xmlns:w14="http://schemas.microsoft.com/office/word/2010/wordml" xmlns:w15="http://schemas.microsoft.com/office/word/2012/wordml" xmlns:w16cex="http://schemas.microsoft.com/office/word/2018/wordml/cex" xmlns:w16cid="http://schemas.microsoft.com/office/word/2016/wordml/cid" xmlns:w16="http://schemas.microsoft.com/office/word/2018/wordml" xmlns:w16sdtdh="http://schemas.microsoft.com/office/word/2020/wordml/sdtdatahash" xmlns:w16sdtfl="http://schemas.microsoft.com/office/word/2024/wordml/sdtformatlock" xmlns:w16se="http://schemas.microsoft.com/office/word/2015/wordml/symex" xmlns:w16du="http://schemas.microsoft.com/office/word/2023/wordml/word16du" xmlns:wne="http://schemas.microsoft.com/office/word/2006/wordml" mc:Ignorable="w14 w15 w16se w16cid w16 w16cex w16sdtdh w16sdtfl w16du wp14">
   <w:body>
     <w:p>
       <w:pPr>
@@ -14,21 +14,7 @@
         <w:rPr>
           <w:b/>
         </w:rPr>
-        <w:t>(</w:t>
-      </w:r>
-      <w:proofErr w:type="gramStart"/>
-      <w:r>
-        <w:rPr>
-          <w:b/>
-        </w:rPr>
-        <w:t>MOBILE:{</w:t>
-      </w:r>
-      <w:proofErr w:type="gramEnd"/>
-      <w:r>
-        <w:rPr>
-          <w:b/>
-        </w:rPr>
-        <w:t>contact})</w:t>
+        <w:t>(MOBILE:{contact})</w:t>
       </w:r>
     </w:p>
     <w:p>
@@ -1074,7 +1060,7 @@
 </file>
 
 <file path=word/styles.xml><?xml version="1.0" encoding="utf-8"?>
-<w:styles xmlns:mc="http://schemas.openxmlformats.org/markup-compatibility/2006" xmlns:r="http://schemas.openxmlformats.org/officeDocument/2006/relationships" xmlns:w="http://schemas.openxmlformats.org/wordprocessingml/2006/main" xmlns:w14="http://schemas.microsoft.com/office/word/2010/wordml" xmlns:w15="http://schemas.microsoft.com/office/word/2012/wordml" xmlns:w16cex="http://schemas.microsoft.com/office/word/2018/wordml/cex" xmlns:w16cid="http://schemas.microsoft.com/office/word/2016/wordml/cid" xmlns:w16="http://schemas.microsoft.com/office/word/2018/wordml" xmlns:w16du="http://schemas.microsoft.com/office/word/2023/wordml/word16du" xmlns:w16sdtdh="http://schemas.microsoft.com/office/word/2020/wordml/sdtdatahash" xmlns:w16se="http://schemas.microsoft.com/office/word/2015/wordml/symex" mc:Ignorable="w14 w15 w16se w16cid w16 w16cex w16sdtdh w16du">
+<w:styles xmlns:mc="http://schemas.openxmlformats.org/markup-compatibility/2006" xmlns:r="http://schemas.openxmlformats.org/officeDocument/2006/relationships" xmlns:w="http://schemas.openxmlformats.org/wordprocessingml/2006/main" xmlns:w14="http://schemas.microsoft.com/office/word/2010/wordml" xmlns:w15="http://schemas.microsoft.com/office/word/2012/wordml" xmlns:w16cex="http://schemas.microsoft.com/office/word/2018/wordml/cex" xmlns:w16cid="http://schemas.microsoft.com/office/word/2016/wordml/cid" xmlns:w16="http://schemas.microsoft.com/office/word/2018/wordml" xmlns:w16sdtdh="http://schemas.microsoft.com/office/word/2020/wordml/sdtdatahash" xmlns:w16sdtfl="http://schemas.microsoft.com/office/word/2024/wordml/sdtformatlock" xmlns:w16se="http://schemas.microsoft.com/office/word/2015/wordml/symex" xmlns:w16du="http://schemas.microsoft.com/office/word/2023/wordml/word16du" mc:Ignorable="w14 w15 w16se w16cid w16 w16cex w16sdtdh w16sdtfl w16du">
   <w:docDefaults>
     <w:rPrDefault>
       <w:rPr>

</xml_diff>